<commit_message>
Report: frame headings as time ranges, merge transcript lines without per-line timestamps
Co-Authored-By: Claude Sonnet 5.5 <noreply@anthropic.com>
Claude-Session: https://claude.ai/code/session_01AU333YXvwcrS2oXycGABJ3
</commit_message>
<xml_diff>
--- a/watch-output/2026-10-11_Facebook_不要再把PDF直接丟給AI-多做這3步品質差很多-AI超級大腦2小時線上講座__1Bggy9HRKs/report.docx
+++ b/watch-output/2026-10-11_Facebook_不要再把PDF直接丟給AI-多做這3步品質差很多-AI超級大腦2小時線上講座__1Bggy9HRKs/report.docx
@@ -1030,7 +1030,7 @@
         <w:pStyle w:val="Heading3"/>
       </w:pPr>
       <w:r>
-        <w:t>[00:00] 畫面</w:t>
+        <w:t>畫面 00:00–00:12</w:t>
       </w:r>
     </w:p>
     <w:p>
@@ -1073,123 +1073,12 @@
       </w:r>
     </w:p>
     <w:p>
-      <w:pPr>
-        <w:pStyle w:val="ListBullet"/>
-      </w:pPr>
-      <w:r>
-        <w:rPr>
-          <w:rFonts w:ascii="Microsoft JhengHei" w:hAnsi="Microsoft JhengHei" w:eastAsia="Microsoft JhengHei"/>
-          <w:b/>
-          <w:sz w:val="21"/>
-        </w:rPr>
-        <w:t>[00:00]</w:t>
-      </w:r>
       <w:r>
         <w:rPr>
           <w:rFonts w:ascii="Microsoft JhengHei" w:hAnsi="Microsoft JhengHei" w:eastAsia="Microsoft JhengHei"/>
           <w:sz w:val="21"/>
         </w:rPr>
-        <w:t xml:space="preserve"> 如果你想要把這本書變成你的AI知識庫</w:t>
-      </w:r>
-    </w:p>
-    <w:p>
-      <w:pPr>
-        <w:pStyle w:val="ListBullet"/>
-      </w:pPr>
-      <w:r>
-        <w:rPr>
-          <w:rFonts w:ascii="Microsoft JhengHei" w:hAnsi="Microsoft JhengHei" w:eastAsia="Microsoft JhengHei"/>
-          <w:b/>
-          <w:sz w:val="21"/>
-        </w:rPr>
-        <w:t>[00:02]</w:t>
-      </w:r>
-      <w:r>
-        <w:rPr>
-          <w:rFonts w:ascii="Microsoft JhengHei" w:hAnsi="Microsoft JhengHei" w:eastAsia="Microsoft JhengHei"/>
-          <w:sz w:val="21"/>
-        </w:rPr>
-        <w:t xml:space="preserve"> 你會怎麼做</w:t>
-      </w:r>
-    </w:p>
-    <w:p>
-      <w:pPr>
-        <w:pStyle w:val="ListBullet"/>
-      </w:pPr>
-      <w:r>
-        <w:rPr>
-          <w:rFonts w:ascii="Microsoft JhengHei" w:hAnsi="Microsoft JhengHei" w:eastAsia="Microsoft JhengHei"/>
-          <w:b/>
-          <w:sz w:val="21"/>
-        </w:rPr>
-        <w:t>[00:03]</w:t>
-      </w:r>
-      <w:r>
-        <w:rPr>
-          <w:rFonts w:ascii="Microsoft JhengHei" w:hAnsi="Microsoft JhengHei" w:eastAsia="Microsoft JhengHei"/>
-          <w:sz w:val="21"/>
-        </w:rPr>
-        <w:t xml:space="preserve"> 大多數的人都會直接把PDF整個上傳的人</w:t>
-      </w:r>
-    </w:p>
-    <w:p>
-      <w:pPr>
-        <w:pStyle w:val="ListBullet"/>
-      </w:pPr>
-      <w:r>
-        <w:rPr>
-          <w:rFonts w:ascii="Microsoft JhengHei" w:hAnsi="Microsoft JhengHei" w:eastAsia="Microsoft JhengHei"/>
-          <w:b/>
-          <w:sz w:val="21"/>
-        </w:rPr>
-        <w:t>[00:06]</w:t>
-      </w:r>
-      <w:r>
-        <w:rPr>
-          <w:rFonts w:ascii="Microsoft JhengHei" w:hAnsi="Microsoft JhengHei" w:eastAsia="Microsoft JhengHei"/>
-          <w:sz w:val="21"/>
-        </w:rPr>
-        <w:t xml:space="preserve"> 你會發現AI回憶的東西好像不像作者寫的</w:t>
-      </w:r>
-    </w:p>
-    <w:p>
-      <w:pPr>
-        <w:pStyle w:val="ListBullet"/>
-      </w:pPr>
-      <w:r>
-        <w:rPr>
-          <w:rFonts w:ascii="Microsoft JhengHei" w:hAnsi="Microsoft JhengHei" w:eastAsia="Microsoft JhengHei"/>
-          <w:b/>
-          <w:sz w:val="21"/>
-        </w:rPr>
-        <w:t>[00:09]</w:t>
-      </w:r>
-      <w:r>
-        <w:rPr>
-          <w:rFonts w:ascii="Microsoft JhengHei" w:hAnsi="Microsoft JhengHei" w:eastAsia="Microsoft JhengHei"/>
-          <w:sz w:val="21"/>
-        </w:rPr>
-        <w:t xml:space="preserve"> 而且你問他很多書語的細節</w:t>
-      </w:r>
-    </w:p>
-    <w:p>
-      <w:pPr>
-        <w:pStyle w:val="ListBullet"/>
-      </w:pPr>
-      <w:r>
-        <w:rPr>
-          <w:rFonts w:ascii="Microsoft JhengHei" w:hAnsi="Microsoft JhengHei" w:eastAsia="Microsoft JhengHei"/>
-          <w:b/>
-          <w:sz w:val="21"/>
-        </w:rPr>
-        <w:t>[00:11]</w:t>
-      </w:r>
-      <w:r>
-        <w:rPr>
-          <w:rFonts w:ascii="Microsoft JhengHei" w:hAnsi="Microsoft JhengHei" w:eastAsia="Microsoft JhengHei"/>
-          <w:sz w:val="21"/>
-        </w:rPr>
-        <w:t xml:space="preserve"> AI都找不到</w:t>
+        <w:t>如果你想要把這本書變成你的AI知識庫，你會怎麼做，大多數的人都會直接把PDF整個上傳的人，你會發現AI回憶的東西好像不像作者寫的，而且你問他很多書語的細節，AI都找不到。</w:t>
       </w:r>
     </w:p>
     <w:p>
@@ -1197,7 +1086,7 @@
         <w:pStyle w:val="Heading3"/>
       </w:pPr>
       <w:r>
-        <w:t>[00:12] 畫面</w:t>
+        <w:t>畫面 00:12–00:46</w:t>
       </w:r>
     </w:p>
     <w:p>
@@ -1240,363 +1129,12 @@
       </w:r>
     </w:p>
     <w:p>
-      <w:pPr>
-        <w:pStyle w:val="ListBullet"/>
-      </w:pPr>
-      <w:r>
-        <w:rPr>
-          <w:rFonts w:ascii="Microsoft JhengHei" w:hAnsi="Microsoft JhengHei" w:eastAsia="Microsoft JhengHei"/>
-          <w:b/>
-          <w:sz w:val="21"/>
-        </w:rPr>
-        <w:t>[00:12]</w:t>
-      </w:r>
       <w:r>
         <w:rPr>
           <w:rFonts w:ascii="Microsoft JhengHei" w:hAnsi="Microsoft JhengHei" w:eastAsia="Microsoft JhengHei"/>
           <w:sz w:val="21"/>
         </w:rPr>
-        <w:t xml:space="preserve"> 這其實是有原因的</w:t>
-      </w:r>
-    </w:p>
-    <w:p>
-      <w:pPr>
-        <w:pStyle w:val="ListBullet"/>
-      </w:pPr>
-      <w:r>
-        <w:rPr>
-          <w:rFonts w:ascii="Microsoft JhengHei" w:hAnsi="Microsoft JhengHei" w:eastAsia="Microsoft JhengHei"/>
-          <w:b/>
-          <w:sz w:val="21"/>
-        </w:rPr>
-        <w:t>[00:13]</w:t>
-      </w:r>
-      <w:r>
-        <w:rPr>
-          <w:rFonts w:ascii="Microsoft JhengHei" w:hAnsi="Microsoft JhengHei" w:eastAsia="Microsoft JhengHei"/>
-          <w:sz w:val="21"/>
-        </w:rPr>
-        <w:t xml:space="preserve"> 為什麼你不能直接上傳PDF</w:t>
-      </w:r>
-    </w:p>
-    <w:p>
-      <w:pPr>
-        <w:pStyle w:val="ListBullet"/>
-      </w:pPr>
-      <w:r>
-        <w:rPr>
-          <w:rFonts w:ascii="Microsoft JhengHei" w:hAnsi="Microsoft JhengHei" w:eastAsia="Microsoft JhengHei"/>
-          <w:b/>
-          <w:sz w:val="21"/>
-        </w:rPr>
-        <w:t>[00:15]</w:t>
-      </w:r>
-      <w:r>
-        <w:rPr>
-          <w:rFonts w:ascii="Microsoft JhengHei" w:hAnsi="Microsoft JhengHei" w:eastAsia="Microsoft JhengHei"/>
-          <w:sz w:val="21"/>
-        </w:rPr>
-        <w:t xml:space="preserve"> 因為AI有三個硬限制</w:t>
-      </w:r>
-    </w:p>
-    <w:p>
-      <w:pPr>
-        <w:pStyle w:val="ListBullet"/>
-      </w:pPr>
-      <w:r>
-        <w:rPr>
-          <w:rFonts w:ascii="Microsoft JhengHei" w:hAnsi="Microsoft JhengHei" w:eastAsia="Microsoft JhengHei"/>
-          <w:b/>
-          <w:sz w:val="21"/>
-        </w:rPr>
-        <w:t>[00:17]</w:t>
-      </w:r>
-      <w:r>
-        <w:rPr>
-          <w:rFonts w:ascii="Microsoft JhengHei" w:hAnsi="Microsoft JhengHei" w:eastAsia="Microsoft JhengHei"/>
-          <w:sz w:val="21"/>
-        </w:rPr>
-        <w:t xml:space="preserve"> 第一個叫做上下文限制</w:t>
-      </w:r>
-    </w:p>
-    <w:p>
-      <w:pPr>
-        <w:pStyle w:val="ListBullet"/>
-      </w:pPr>
-      <w:r>
-        <w:rPr>
-          <w:rFonts w:ascii="Microsoft JhengHei" w:hAnsi="Microsoft JhengHei" w:eastAsia="Microsoft JhengHei"/>
-          <w:b/>
-          <w:sz w:val="21"/>
-        </w:rPr>
-        <w:t>[00:18]</w:t>
-      </w:r>
-      <w:r>
-        <w:rPr>
-          <w:rFonts w:ascii="Microsoft JhengHei" w:hAnsi="Microsoft JhengHei" w:eastAsia="Microsoft JhengHei"/>
-          <w:sz w:val="21"/>
-        </w:rPr>
-        <w:t xml:space="preserve"> AI每次能夠讀的內容其實是有限的</w:t>
-      </w:r>
-    </w:p>
-    <w:p>
-      <w:pPr>
-        <w:pStyle w:val="ListBullet"/>
-      </w:pPr>
-      <w:r>
-        <w:rPr>
-          <w:rFonts w:ascii="Microsoft JhengHei" w:hAnsi="Microsoft JhengHei" w:eastAsia="Microsoft JhengHei"/>
-          <w:b/>
-          <w:sz w:val="21"/>
-        </w:rPr>
-        <w:t>[00:22]</w:t>
-      </w:r>
-      <w:r>
-        <w:rPr>
-          <w:rFonts w:ascii="Microsoft JhengHei" w:hAnsi="Microsoft JhengHei" w:eastAsia="Microsoft JhengHei"/>
-          <w:sz w:val="21"/>
-        </w:rPr>
-        <w:t xml:space="preserve"> 他不可能一次看到整本書</w:t>
-      </w:r>
-    </w:p>
-    <w:p>
-      <w:pPr>
-        <w:pStyle w:val="ListBullet"/>
-      </w:pPr>
-      <w:r>
-        <w:rPr>
-          <w:rFonts w:ascii="Microsoft JhengHei" w:hAnsi="Microsoft JhengHei" w:eastAsia="Microsoft JhengHei"/>
-          <w:b/>
-          <w:sz w:val="21"/>
-        </w:rPr>
-        <w:t>[00:23]</w:t>
-      </w:r>
-      <w:r>
-        <w:rPr>
-          <w:rFonts w:ascii="Microsoft JhengHei" w:hAnsi="Microsoft JhengHei" w:eastAsia="Microsoft JhengHei"/>
-          <w:sz w:val="21"/>
-        </w:rPr>
-        <w:t xml:space="preserve"> 大部分回答你的時候都是用他的嘗試在回答</w:t>
-      </w:r>
-    </w:p>
-    <w:p>
-      <w:pPr>
-        <w:pStyle w:val="ListBullet"/>
-      </w:pPr>
-      <w:r>
-        <w:rPr>
-          <w:rFonts w:ascii="Microsoft JhengHei" w:hAnsi="Microsoft JhengHei" w:eastAsia="Microsoft JhengHei"/>
-          <w:b/>
-          <w:sz w:val="21"/>
-        </w:rPr>
-        <w:t>[00:26]</w:t>
-      </w:r>
-      <w:r>
-        <w:rPr>
-          <w:rFonts w:ascii="Microsoft JhengHei" w:hAnsi="Microsoft JhengHei" w:eastAsia="Microsoft JhengHei"/>
-          <w:sz w:val="21"/>
-        </w:rPr>
-        <w:t xml:space="preserve"> 他不是用他真的看到的東西在回答</w:t>
-      </w:r>
-    </w:p>
-    <w:p>
-      <w:pPr>
-        <w:pStyle w:val="ListBullet"/>
-      </w:pPr>
-      <w:r>
-        <w:rPr>
-          <w:rFonts w:ascii="Microsoft JhengHei" w:hAnsi="Microsoft JhengHei" w:eastAsia="Microsoft JhengHei"/>
-          <w:b/>
-          <w:sz w:val="21"/>
-        </w:rPr>
-        <w:t>[00:28]</w:t>
-      </w:r>
-      <w:r>
-        <w:rPr>
-          <w:rFonts w:ascii="Microsoft JhengHei" w:hAnsi="Microsoft JhengHei" w:eastAsia="Microsoft JhengHei"/>
-          <w:sz w:val="21"/>
-        </w:rPr>
-        <w:t xml:space="preserve"> 另外一個叫做格式限制</w:t>
-      </w:r>
-    </w:p>
-    <w:p>
-      <w:pPr>
-        <w:pStyle w:val="ListBullet"/>
-      </w:pPr>
-      <w:r>
-        <w:rPr>
-          <w:rFonts w:ascii="Microsoft JhengHei" w:hAnsi="Microsoft JhengHei" w:eastAsia="Microsoft JhengHei"/>
-          <w:b/>
-          <w:sz w:val="21"/>
-        </w:rPr>
-        <w:t>[00:30]</w:t>
-      </w:r>
-      <w:r>
-        <w:rPr>
-          <w:rFonts w:ascii="Microsoft JhengHei" w:hAnsi="Microsoft JhengHei" w:eastAsia="Microsoft JhengHei"/>
-          <w:sz w:val="21"/>
-        </w:rPr>
-        <w:t xml:space="preserve"> 各位知道PDF讓我們看很舒服</w:t>
-      </w:r>
-    </w:p>
-    <w:p>
-      <w:pPr>
-        <w:pStyle w:val="ListBullet"/>
-      </w:pPr>
-      <w:r>
-        <w:rPr>
-          <w:rFonts w:ascii="Microsoft JhengHei" w:hAnsi="Microsoft JhengHei" w:eastAsia="Microsoft JhengHei"/>
-          <w:b/>
-          <w:sz w:val="21"/>
-        </w:rPr>
-        <w:t>[00:32]</w:t>
-      </w:r>
-      <w:r>
-        <w:rPr>
-          <w:rFonts w:ascii="Microsoft JhengHei" w:hAnsi="Microsoft JhengHei" w:eastAsia="Microsoft JhengHei"/>
-          <w:sz w:val="21"/>
-        </w:rPr>
-        <w:t xml:space="preserve"> 但AI看到的是一堆格式的亂碼</w:t>
-      </w:r>
-    </w:p>
-    <w:p>
-      <w:pPr>
-        <w:pStyle w:val="ListBullet"/>
-      </w:pPr>
-      <w:r>
-        <w:rPr>
-          <w:rFonts w:ascii="Microsoft JhengHei" w:hAnsi="Microsoft JhengHei" w:eastAsia="Microsoft JhengHei"/>
-          <w:b/>
-          <w:sz w:val="21"/>
-        </w:rPr>
-        <w:t>[00:34]</w:t>
-      </w:r>
-      <w:r>
-        <w:rPr>
-          <w:rFonts w:ascii="Microsoft JhengHei" w:hAnsi="Microsoft JhengHei" w:eastAsia="Microsoft JhengHei"/>
-          <w:sz w:val="21"/>
-        </w:rPr>
-        <w:t xml:space="preserve"> 再來就是理解限制</w:t>
-      </w:r>
-    </w:p>
-    <w:p>
-      <w:pPr>
-        <w:pStyle w:val="ListBullet"/>
-      </w:pPr>
-      <w:r>
-        <w:rPr>
-          <w:rFonts w:ascii="Microsoft JhengHei" w:hAnsi="Microsoft JhengHei" w:eastAsia="Microsoft JhengHei"/>
-          <w:b/>
-          <w:sz w:val="21"/>
-        </w:rPr>
-        <w:t>[00:35]</w:t>
-      </w:r>
-      <w:r>
-        <w:rPr>
-          <w:rFonts w:ascii="Microsoft JhengHei" w:hAnsi="Microsoft JhengHei" w:eastAsia="Microsoft JhengHei"/>
-          <w:sz w:val="21"/>
-        </w:rPr>
-        <w:t xml:space="preserve"> 它沒辦法總結第一章跟第十二章的知識</w:t>
-      </w:r>
-    </w:p>
-    <w:p>
-      <w:pPr>
-        <w:pStyle w:val="ListBullet"/>
-      </w:pPr>
-      <w:r>
-        <w:rPr>
-          <w:rFonts w:ascii="Microsoft JhengHei" w:hAnsi="Microsoft JhengHei" w:eastAsia="Microsoft JhengHei"/>
-          <w:b/>
-          <w:sz w:val="21"/>
-        </w:rPr>
-        <w:t>[00:38]</w:t>
-      </w:r>
-      <w:r>
-        <w:rPr>
-          <w:rFonts w:ascii="Microsoft JhengHei" w:hAnsi="Microsoft JhengHei" w:eastAsia="Microsoft JhengHei"/>
-          <w:sz w:val="21"/>
-        </w:rPr>
-        <w:t xml:space="preserve"> 它是一章一章讀的</w:t>
-      </w:r>
-    </w:p>
-    <w:p>
-      <w:pPr>
-        <w:pStyle w:val="ListBullet"/>
-      </w:pPr>
-      <w:r>
-        <w:rPr>
-          <w:rFonts w:ascii="Microsoft JhengHei" w:hAnsi="Microsoft JhengHei" w:eastAsia="Microsoft JhengHei"/>
-          <w:b/>
-          <w:sz w:val="21"/>
-        </w:rPr>
-        <w:t>[00:40]</w:t>
-      </w:r>
-      <w:r>
-        <w:rPr>
-          <w:rFonts w:ascii="Microsoft JhengHei" w:hAnsi="Microsoft JhengHei" w:eastAsia="Microsoft JhengHei"/>
-          <w:sz w:val="21"/>
-        </w:rPr>
-        <w:t xml:space="preserve"> 它根本不知道怎麼誇張解的閱讀</w:t>
-      </w:r>
-    </w:p>
-    <w:p>
-      <w:pPr>
-        <w:pStyle w:val="ListBullet"/>
-      </w:pPr>
-      <w:r>
-        <w:rPr>
-          <w:rFonts w:ascii="Microsoft JhengHei" w:hAnsi="Microsoft JhengHei" w:eastAsia="Microsoft JhengHei"/>
-          <w:b/>
-          <w:sz w:val="21"/>
-        </w:rPr>
-        <w:t>[00:42]</w:t>
-      </w:r>
-      <w:r>
-        <w:rPr>
-          <w:rFonts w:ascii="Microsoft JhengHei" w:hAnsi="Microsoft JhengHei" w:eastAsia="Microsoft JhengHei"/>
-          <w:sz w:val="21"/>
-        </w:rPr>
-        <w:t xml:space="preserve"> 有理解上的通用限制</w:t>
-      </w:r>
-    </w:p>
-    <w:p>
-      <w:pPr>
-        <w:pStyle w:val="ListBullet"/>
-      </w:pPr>
-      <w:r>
-        <w:rPr>
-          <w:rFonts w:ascii="Microsoft JhengHei" w:hAnsi="Microsoft JhengHei" w:eastAsia="Microsoft JhengHei"/>
-          <w:b/>
-          <w:sz w:val="21"/>
-        </w:rPr>
-        <w:t>[00:43]</w:t>
-      </w:r>
-      <w:r>
-        <w:rPr>
-          <w:rFonts w:ascii="Microsoft JhengHei" w:hAnsi="Microsoft JhengHei" w:eastAsia="Microsoft JhengHei"/>
-          <w:sz w:val="21"/>
-        </w:rPr>
-        <w:t xml:space="preserve"> 如果你是AI新手</w:t>
-      </w:r>
-    </w:p>
-    <w:p>
-      <w:pPr>
-        <w:pStyle w:val="ListBullet"/>
-      </w:pPr>
-      <w:r>
-        <w:rPr>
-          <w:rFonts w:ascii="Microsoft JhengHei" w:hAnsi="Microsoft JhengHei" w:eastAsia="Microsoft JhengHei"/>
-          <w:b/>
-          <w:sz w:val="21"/>
-        </w:rPr>
-        <w:t>[00:45]</w:t>
-      </w:r>
-      <w:r>
-        <w:rPr>
-          <w:rFonts w:ascii="Microsoft JhengHei" w:hAnsi="Microsoft JhengHei" w:eastAsia="Microsoft JhengHei"/>
-          <w:sz w:val="21"/>
-        </w:rPr>
-        <w:t xml:space="preserve"> 你至少做到什麼</w:t>
+        <w:t>這其實是有原因的，為什麼你不能直接上傳PDF，因為AI有三個硬限制，第一個叫做上下文限制，AI每次能夠讀的內容其實是有限的，他不可能一次看到整本書，大部分回答你的時候都是用他的嘗試在回答，他不是用他真的看到的東西在回答，另外一個叫做格式限制，各位知道PDF讓我們看很舒服，但AI看到的是一堆格式的亂碼，再來就是理解限制，它沒辦法總結第一章跟第十二章的知識，它是一章一章讀的，它根本不知道怎麼誇張解的閱讀，有理解上的通用限制，如果你是AI新手，你至少做到什麼。</w:t>
       </w:r>
     </w:p>
     <w:p>
@@ -1604,7 +1142,7 @@
         <w:pStyle w:val="Heading3"/>
       </w:pPr>
       <w:r>
-        <w:t>[00:46] 畫面</w:t>
+        <w:t>畫面 00:46–01:07</w:t>
       </w:r>
     </w:p>
     <w:p>
@@ -1647,203 +1185,12 @@
       </w:r>
     </w:p>
     <w:p>
-      <w:pPr>
-        <w:pStyle w:val="ListBullet"/>
-      </w:pPr>
-      <w:r>
-        <w:rPr>
-          <w:rFonts w:ascii="Microsoft JhengHei" w:hAnsi="Microsoft JhengHei" w:eastAsia="Microsoft JhengHei"/>
-          <w:b/>
-          <w:sz w:val="21"/>
-        </w:rPr>
-        <w:t>[00:46]</w:t>
-      </w:r>
       <w:r>
         <w:rPr>
           <w:rFonts w:ascii="Microsoft JhengHei" w:hAnsi="Microsoft JhengHei" w:eastAsia="Microsoft JhengHei"/>
           <w:sz w:val="21"/>
         </w:rPr>
-        <w:t xml:space="preserve"> 懂得怎麼把PDF轉成Markdown這個格式</w:t>
-      </w:r>
-    </w:p>
-    <w:p>
-      <w:pPr>
-        <w:pStyle w:val="ListBullet"/>
-      </w:pPr>
-      <w:r>
-        <w:rPr>
-          <w:rFonts w:ascii="Microsoft JhengHei" w:hAnsi="Microsoft JhengHei" w:eastAsia="Microsoft JhengHei"/>
-          <w:b/>
-          <w:sz w:val="21"/>
-        </w:rPr>
-        <w:t>[00:49]</w:t>
-      </w:r>
-      <w:r>
-        <w:rPr>
-          <w:rFonts w:ascii="Microsoft JhengHei" w:hAnsi="Microsoft JhengHei" w:eastAsia="Microsoft JhengHei"/>
-          <w:sz w:val="21"/>
-        </w:rPr>
-        <w:t xml:space="preserve"> 這兩個檔名最大的差別是什麼呢</w:t>
-      </w:r>
-    </w:p>
-    <w:p>
-      <w:pPr>
-        <w:pStyle w:val="ListBullet"/>
-      </w:pPr>
-      <w:r>
-        <w:rPr>
-          <w:rFonts w:ascii="Microsoft JhengHei" w:hAnsi="Microsoft JhengHei" w:eastAsia="Microsoft JhengHei"/>
-          <w:b/>
-          <w:sz w:val="21"/>
-        </w:rPr>
-        <w:t>[00:50]</w:t>
-      </w:r>
-      <w:r>
-        <w:rPr>
-          <w:rFonts w:ascii="Microsoft JhengHei" w:hAnsi="Microsoft JhengHei" w:eastAsia="Microsoft JhengHei"/>
-          <w:sz w:val="21"/>
-        </w:rPr>
-        <w:t xml:space="preserve"> PDF是一種被封裝好的閱讀結果</w:t>
-      </w:r>
-    </w:p>
-    <w:p>
-      <w:pPr>
-        <w:pStyle w:val="ListBullet"/>
-      </w:pPr>
-      <w:r>
-        <w:rPr>
-          <w:rFonts w:ascii="Microsoft JhengHei" w:hAnsi="Microsoft JhengHei" w:eastAsia="Microsoft JhengHei"/>
-          <w:b/>
-          <w:sz w:val="21"/>
-        </w:rPr>
-        <w:t>[00:53]</w:t>
-      </w:r>
-      <w:r>
-        <w:rPr>
-          <w:rFonts w:ascii="Microsoft JhengHei" w:hAnsi="Microsoft JhengHei" w:eastAsia="Microsoft JhengHei"/>
-          <w:sz w:val="21"/>
-        </w:rPr>
-        <w:t xml:space="preserve"> 它是幫你設計好</w:t>
-      </w:r>
-    </w:p>
-    <w:p>
-      <w:pPr>
-        <w:pStyle w:val="ListBullet"/>
-      </w:pPr>
-      <w:r>
-        <w:rPr>
-          <w:rFonts w:ascii="Microsoft JhengHei" w:hAnsi="Microsoft JhengHei" w:eastAsia="Microsoft JhengHei"/>
-          <w:b/>
-          <w:sz w:val="21"/>
-        </w:rPr>
-        <w:t>[00:54]</w:t>
-      </w:r>
-      <w:r>
-        <w:rPr>
-          <w:rFonts w:ascii="Microsoft JhengHei" w:hAnsi="Microsoft JhengHei" w:eastAsia="Microsoft JhengHei"/>
-          <w:sz w:val="21"/>
-        </w:rPr>
-        <w:t xml:space="preserve"> 給人類看起來很舒服的版面</w:t>
-      </w:r>
-    </w:p>
-    <w:p>
-      <w:pPr>
-        <w:pStyle w:val="ListBullet"/>
-      </w:pPr>
-      <w:r>
-        <w:rPr>
-          <w:rFonts w:ascii="Microsoft JhengHei" w:hAnsi="Microsoft JhengHei" w:eastAsia="Microsoft JhengHei"/>
-          <w:b/>
-          <w:sz w:val="21"/>
-        </w:rPr>
-        <w:t>[00:57]</w:t>
-      </w:r>
-      <w:r>
-        <w:rPr>
-          <w:rFonts w:ascii="Microsoft JhengHei" w:hAnsi="Microsoft JhengHei" w:eastAsia="Microsoft JhengHei"/>
-          <w:sz w:val="21"/>
-        </w:rPr>
-        <w:t xml:space="preserve"> 但是Markdown的格式才是可以被機器理解的結構化知識</w:t>
-      </w:r>
-    </w:p>
-    <w:p>
-      <w:pPr>
-        <w:pStyle w:val="ListBullet"/>
-      </w:pPr>
-      <w:r>
-        <w:rPr>
-          <w:rFonts w:ascii="Microsoft JhengHei" w:hAnsi="Microsoft JhengHei" w:eastAsia="Microsoft JhengHei"/>
-          <w:b/>
-          <w:sz w:val="21"/>
-        </w:rPr>
-        <w:t>[01:01]</w:t>
-      </w:r>
-      <w:r>
-        <w:rPr>
-          <w:rFonts w:ascii="Microsoft JhengHei" w:hAnsi="Microsoft JhengHei" w:eastAsia="Microsoft JhengHei"/>
-          <w:sz w:val="21"/>
-        </w:rPr>
-        <w:t xml:space="preserve"> 如果你給PDF的話</w:t>
-      </w:r>
-    </w:p>
-    <w:p>
-      <w:pPr>
-        <w:pStyle w:val="ListBullet"/>
-      </w:pPr>
-      <w:r>
-        <w:rPr>
-          <w:rFonts w:ascii="Microsoft JhengHei" w:hAnsi="Microsoft JhengHei" w:eastAsia="Microsoft JhengHei"/>
-          <w:b/>
-          <w:sz w:val="21"/>
-        </w:rPr>
-        <w:t>[01:03]</w:t>
-      </w:r>
-      <w:r>
-        <w:rPr>
-          <w:rFonts w:ascii="Microsoft JhengHei" w:hAnsi="Microsoft JhengHei" w:eastAsia="Microsoft JhengHei"/>
-          <w:sz w:val="21"/>
-        </w:rPr>
-        <w:t xml:space="preserve"> 他看不到他的標題</w:t>
-      </w:r>
-    </w:p>
-    <w:p>
-      <w:pPr>
-        <w:pStyle w:val="ListBullet"/>
-      </w:pPr>
-      <w:r>
-        <w:rPr>
-          <w:rFonts w:ascii="Microsoft JhengHei" w:hAnsi="Microsoft JhengHei" w:eastAsia="Microsoft JhengHei"/>
-          <w:b/>
-          <w:sz w:val="21"/>
-        </w:rPr>
-        <w:t>[01:04]</w:t>
-      </w:r>
-      <w:r>
-        <w:rPr>
-          <w:rFonts w:ascii="Microsoft JhengHei" w:hAnsi="Microsoft JhengHei" w:eastAsia="Microsoft JhengHei"/>
-          <w:sz w:val="21"/>
-        </w:rPr>
-        <w:t xml:space="preserve"> 看不到他的結構</w:t>
-      </w:r>
-    </w:p>
-    <w:p>
-      <w:pPr>
-        <w:pStyle w:val="ListBullet"/>
-      </w:pPr>
-      <w:r>
-        <w:rPr>
-          <w:rFonts w:ascii="Microsoft JhengHei" w:hAnsi="Microsoft JhengHei" w:eastAsia="Microsoft JhengHei"/>
-          <w:b/>
-          <w:sz w:val="21"/>
-        </w:rPr>
-        <w:t>[01:05]</w:t>
-      </w:r>
-      <w:r>
-        <w:rPr>
-          <w:rFonts w:ascii="Microsoft JhengHei" w:hAnsi="Microsoft JhengHei" w:eastAsia="Microsoft JhengHei"/>
-          <w:sz w:val="21"/>
-        </w:rPr>
-        <w:t xml:space="preserve"> 但在Markdown裡面可以</w:t>
+        <w:t>懂得怎麼把PDF轉成Markdown這個格式，這兩個檔名最大的差別是什麼呢，PDF是一種被封裝好的閱讀結果，它是幫你設計好，給人類看起來很舒服的版面，但是Markdown的格式才是可以被機器理解的結構化知識，如果你給PDF的話，他看不到他的標題，看不到他的結構，但在Markdown裡面可以。</w:t>
       </w:r>
     </w:p>
     <w:p>
@@ -1851,7 +1198,7 @@
         <w:pStyle w:val="Heading3"/>
       </w:pPr>
       <w:r>
-        <w:t>[01:07] 畫面</w:t>
+        <w:t>畫面 01:07–01:28</w:t>
       </w:r>
     </w:p>
     <w:p>
@@ -1894,183 +1241,12 @@
       </w:r>
     </w:p>
     <w:p>
-      <w:pPr>
-        <w:pStyle w:val="ListBullet"/>
-      </w:pPr>
-      <w:r>
-        <w:rPr>
-          <w:rFonts w:ascii="Microsoft JhengHei" w:hAnsi="Microsoft JhengHei" w:eastAsia="Microsoft JhengHei"/>
-          <w:b/>
-          <w:sz w:val="21"/>
-        </w:rPr>
-        <w:t>[01:07]</w:t>
-      </w:r>
       <w:r>
         <w:rPr>
           <w:rFonts w:ascii="Microsoft JhengHei" w:hAnsi="Microsoft JhengHei" w:eastAsia="Microsoft JhengHei"/>
           <w:sz w:val="21"/>
         </w:rPr>
-        <w:t xml:space="preserve"> 老手會多做兩步</w:t>
-      </w:r>
-    </w:p>
-    <w:p>
-      <w:pPr>
-        <w:pStyle w:val="ListBullet"/>
-      </w:pPr>
-      <w:r>
-        <w:rPr>
-          <w:rFonts w:ascii="Microsoft JhengHei" w:hAnsi="Microsoft JhengHei" w:eastAsia="Microsoft JhengHei"/>
-          <w:b/>
-          <w:sz w:val="21"/>
-        </w:rPr>
-        <w:t>[01:08]</w:t>
-      </w:r>
-      <w:r>
-        <w:rPr>
-          <w:rFonts w:ascii="Microsoft JhengHei" w:hAnsi="Microsoft JhengHei" w:eastAsia="Microsoft JhengHei"/>
-          <w:sz w:val="21"/>
-        </w:rPr>
-        <w:t xml:space="preserve"> 就是你會幫他在Markdown的這個格式上面</w:t>
-      </w:r>
-    </w:p>
-    <w:p>
-      <w:pPr>
-        <w:pStyle w:val="ListBullet"/>
-      </w:pPr>
-      <w:r>
-        <w:rPr>
-          <w:rFonts w:ascii="Microsoft JhengHei" w:hAnsi="Microsoft JhengHei" w:eastAsia="Microsoft JhengHei"/>
-          <w:b/>
-          <w:sz w:val="21"/>
-        </w:rPr>
-        <w:t>[01:12]</w:t>
-      </w:r>
-      <w:r>
-        <w:rPr>
-          <w:rFonts w:ascii="Microsoft JhengHei" w:hAnsi="Microsoft JhengHei" w:eastAsia="Microsoft JhengHei"/>
-          <w:sz w:val="21"/>
-        </w:rPr>
-        <w:t xml:space="preserve"> 加上每個章節的摘要</w:t>
-      </w:r>
-    </w:p>
-    <w:p>
-      <w:pPr>
-        <w:pStyle w:val="ListBullet"/>
-      </w:pPr>
-      <w:r>
-        <w:rPr>
-          <w:rFonts w:ascii="Microsoft JhengHei" w:hAnsi="Microsoft JhengHei" w:eastAsia="Microsoft JhengHei"/>
-          <w:b/>
-          <w:sz w:val="21"/>
-        </w:rPr>
-        <w:t>[01:13]</w:t>
-      </w:r>
-      <w:r>
-        <w:rPr>
-          <w:rFonts w:ascii="Microsoft JhengHei" w:hAnsi="Microsoft JhengHei" w:eastAsia="Microsoft JhengHei"/>
-          <w:sz w:val="21"/>
-        </w:rPr>
-        <w:t xml:space="preserve"> 關鍵詞跟核心概念</w:t>
-      </w:r>
-    </w:p>
-    <w:p>
-      <w:pPr>
-        <w:pStyle w:val="ListBullet"/>
-      </w:pPr>
-      <w:r>
-        <w:rPr>
-          <w:rFonts w:ascii="Microsoft JhengHei" w:hAnsi="Microsoft JhengHei" w:eastAsia="Microsoft JhengHei"/>
-          <w:b/>
-          <w:sz w:val="21"/>
-        </w:rPr>
-        <w:t>[01:16]</w:t>
-      </w:r>
-      <w:r>
-        <w:rPr>
-          <w:rFonts w:ascii="Microsoft JhengHei" w:hAnsi="Microsoft JhengHei" w:eastAsia="Microsoft JhengHei"/>
-          <w:sz w:val="21"/>
-        </w:rPr>
-        <w:t xml:space="preserve"> 就好像你幫AI畫重點做索引</w:t>
-      </w:r>
-    </w:p>
-    <w:p>
-      <w:pPr>
-        <w:pStyle w:val="ListBullet"/>
-      </w:pPr>
-      <w:r>
-        <w:rPr>
-          <w:rFonts w:ascii="Microsoft JhengHei" w:hAnsi="Microsoft JhengHei" w:eastAsia="Microsoft JhengHei"/>
-          <w:b/>
-          <w:sz w:val="21"/>
-        </w:rPr>
-        <w:t>[01:18]</w:t>
-      </w:r>
-      <w:r>
-        <w:rPr>
-          <w:rFonts w:ascii="Microsoft JhengHei" w:hAnsi="Microsoft JhengHei" w:eastAsia="Microsoft JhengHei"/>
-          <w:sz w:val="21"/>
-        </w:rPr>
-        <w:t xml:space="preserve"> 未來你問任何問題的時候</w:t>
-      </w:r>
-    </w:p>
-    <w:p>
-      <w:pPr>
-        <w:pStyle w:val="ListBullet"/>
-      </w:pPr>
-      <w:r>
-        <w:rPr>
-          <w:rFonts w:ascii="Microsoft JhengHei" w:hAnsi="Microsoft JhengHei" w:eastAsia="Microsoft JhengHei"/>
-          <w:b/>
-          <w:sz w:val="21"/>
-        </w:rPr>
-        <w:t>[01:19]</w:t>
-      </w:r>
-      <w:r>
-        <w:rPr>
-          <w:rFonts w:ascii="Microsoft JhengHei" w:hAnsi="Microsoft JhengHei" w:eastAsia="Microsoft JhengHei"/>
-          <w:sz w:val="21"/>
-        </w:rPr>
-        <w:t xml:space="preserve"> AI可以先去找你做過的索引</w:t>
-      </w:r>
-    </w:p>
-    <w:p>
-      <w:pPr>
-        <w:pStyle w:val="ListBullet"/>
-      </w:pPr>
-      <w:r>
-        <w:rPr>
-          <w:rFonts w:ascii="Microsoft JhengHei" w:hAnsi="Microsoft JhengHei" w:eastAsia="Microsoft JhengHei"/>
-          <w:b/>
-          <w:sz w:val="21"/>
-        </w:rPr>
-        <w:t>[01:22]</w:t>
-      </w:r>
-      <w:r>
-        <w:rPr>
-          <w:rFonts w:ascii="Microsoft JhengHei" w:hAnsi="Microsoft JhengHei" w:eastAsia="Microsoft JhengHei"/>
-          <w:sz w:val="21"/>
-        </w:rPr>
-        <w:t xml:space="preserve"> 他將更有機率找到你要的內容</w:t>
-      </w:r>
-    </w:p>
-    <w:p>
-      <w:pPr>
-        <w:pStyle w:val="ListBullet"/>
-      </w:pPr>
-      <w:r>
-        <w:rPr>
-          <w:rFonts w:ascii="Microsoft JhengHei" w:hAnsi="Microsoft JhengHei" w:eastAsia="Microsoft JhengHei"/>
-          <w:b/>
-          <w:sz w:val="21"/>
-        </w:rPr>
-        <w:t>[01:24]</w:t>
-      </w:r>
-      <w:r>
-        <w:rPr>
-          <w:rFonts w:ascii="Microsoft JhengHei" w:hAnsi="Microsoft JhengHei" w:eastAsia="Microsoft JhengHei"/>
-          <w:sz w:val="21"/>
-        </w:rPr>
-        <w:t xml:space="preserve"> 第二個動作就很少人會做的叫做BLM什麼叫BLM呢?讓AI用文字去描述出這本書裡面的所有的圖你可以理解 AI 可以看得到文字對不對AI 看不到圖但是很多專業知識庫裡面</w:t>
+        <w:t>老手會多做兩步，就是你會幫他在Markdown的這個格式上面，加上每個章節的摘要，關鍵詞跟核心概念，就好像你幫AI畫重點做索引，未來你問任何問題的時候，AI可以先去找你做過的索引，他將更有機率找到你要的內容，第二個動作就很少人會做的叫做BLM什麼叫BLM呢?讓AI用文字去描述出這本書裡面的所有的圖你可以理解 AI 可以看得到文字對不對AI 看不到圖但是很多專業知識庫裡面。</w:t>
       </w:r>
     </w:p>
     <w:p>
@@ -2078,7 +1254,7 @@
         <w:pStyle w:val="Heading3"/>
       </w:pPr>
       <w:r>
-        <w:t>[01:28] 畫面</w:t>
+        <w:t>畫面 01:28–02:10</w:t>
       </w:r>
     </w:p>
     <w:p>
@@ -2121,403 +1297,12 @@
       </w:r>
     </w:p>
     <w:p>
-      <w:pPr>
-        <w:pStyle w:val="ListBullet"/>
-      </w:pPr>
-      <w:r>
-        <w:rPr>
-          <w:rFonts w:ascii="Microsoft JhengHei" w:hAnsi="Microsoft JhengHei" w:eastAsia="Microsoft JhengHei"/>
-          <w:b/>
-          <w:sz w:val="21"/>
-        </w:rPr>
-        <w:t>[01:37]</w:t>
-      </w:r>
       <w:r>
         <w:rPr>
           <w:rFonts w:ascii="Microsoft JhengHei" w:hAnsi="Microsoft JhengHei" w:eastAsia="Microsoft JhengHei"/>
           <w:sz w:val="21"/>
         </w:rPr>
-        <w:t xml:space="preserve"> 真正有價值的東西在哪裡</w:t>
-      </w:r>
-    </w:p>
-    <w:p>
-      <w:pPr>
-        <w:pStyle w:val="ListBullet"/>
-      </w:pPr>
-      <w:r>
-        <w:rPr>
-          <w:rFonts w:ascii="Microsoft JhengHei" w:hAnsi="Microsoft JhengHei" w:eastAsia="Microsoft JhengHei"/>
-          <w:b/>
-          <w:sz w:val="21"/>
-        </w:rPr>
-        <w:t>[01:38]</w:t>
-      </w:r>
-      <w:r>
-        <w:rPr>
-          <w:rFonts w:ascii="Microsoft JhengHei" w:hAnsi="Microsoft JhengHei" w:eastAsia="Microsoft JhengHei"/>
-          <w:sz w:val="21"/>
-        </w:rPr>
-        <w:t xml:space="preserve"> 在圖上</w:t>
-      </w:r>
-    </w:p>
-    <w:p>
-      <w:pPr>
-        <w:pStyle w:val="ListBullet"/>
-      </w:pPr>
-      <w:r>
-        <w:rPr>
-          <w:rFonts w:ascii="Microsoft JhengHei" w:hAnsi="Microsoft JhengHei" w:eastAsia="Microsoft JhengHei"/>
-          <w:b/>
-          <w:sz w:val="21"/>
-        </w:rPr>
-        <w:t>[01:39]</w:t>
-      </w:r>
-      <w:r>
-        <w:rPr>
-          <w:rFonts w:ascii="Microsoft JhengHei" w:hAnsi="Microsoft JhengHei" w:eastAsia="Microsoft JhengHei"/>
-          <w:sz w:val="21"/>
-        </w:rPr>
-        <w:t xml:space="preserve"> 所以你要做這個動作叫做 VLM</w:t>
-      </w:r>
-    </w:p>
-    <w:p>
-      <w:pPr>
-        <w:pStyle w:val="ListBullet"/>
-      </w:pPr>
-      <w:r>
-        <w:rPr>
-          <w:rFonts w:ascii="Microsoft JhengHei" w:hAnsi="Microsoft JhengHei" w:eastAsia="Microsoft JhengHei"/>
-          <w:b/>
-          <w:sz w:val="21"/>
-        </w:rPr>
-        <w:t>[01:41]</w:t>
-      </w:r>
-      <w:r>
-        <w:rPr>
-          <w:rFonts w:ascii="Microsoft JhengHei" w:hAnsi="Microsoft JhengHei" w:eastAsia="Microsoft JhengHei"/>
-          <w:sz w:val="21"/>
-        </w:rPr>
-        <w:t xml:space="preserve"> VLM 的動作就是</w:t>
-      </w:r>
-    </w:p>
-    <w:p>
-      <w:pPr>
-        <w:pStyle w:val="ListBullet"/>
-      </w:pPr>
-      <w:r>
-        <w:rPr>
-          <w:rFonts w:ascii="Microsoft JhengHei" w:hAnsi="Microsoft JhengHei" w:eastAsia="Microsoft JhengHei"/>
-          <w:b/>
-          <w:sz w:val="21"/>
-        </w:rPr>
-        <w:t>[01:42]</w:t>
-      </w:r>
-      <w:r>
-        <w:rPr>
-          <w:rFonts w:ascii="Microsoft JhengHei" w:hAnsi="Microsoft JhengHei" w:eastAsia="Microsoft JhengHei"/>
-          <w:sz w:val="21"/>
-        </w:rPr>
-        <w:t xml:space="preserve"> 讓 AI 幫你用文字去描述一個圖</w:t>
-      </w:r>
-    </w:p>
-    <w:p>
-      <w:pPr>
-        <w:pStyle w:val="ListBullet"/>
-      </w:pPr>
-      <w:r>
-        <w:rPr>
-          <w:rFonts w:ascii="Microsoft JhengHei" w:hAnsi="Microsoft JhengHei" w:eastAsia="Microsoft JhengHei"/>
-          <w:b/>
-          <w:sz w:val="21"/>
-        </w:rPr>
-        <w:t>[01:44]</w:t>
-      </w:r>
-      <w:r>
-        <w:rPr>
-          <w:rFonts w:ascii="Microsoft JhengHei" w:hAnsi="Microsoft JhengHei" w:eastAsia="Microsoft JhengHei"/>
-          <w:sz w:val="21"/>
-        </w:rPr>
-        <w:t xml:space="preserve"> 是什麼意思</w:t>
-      </w:r>
-    </w:p>
-    <w:p>
-      <w:pPr>
-        <w:pStyle w:val="ListBullet"/>
-      </w:pPr>
-      <w:r>
-        <w:rPr>
-          <w:rFonts w:ascii="Microsoft JhengHei" w:hAnsi="Microsoft JhengHei" w:eastAsia="Microsoft JhengHei"/>
-          <w:b/>
-          <w:sz w:val="21"/>
-        </w:rPr>
-        <w:t>[01:45]</w:t>
-      </w:r>
-      <w:r>
-        <w:rPr>
-          <w:rFonts w:ascii="Microsoft JhengHei" w:hAnsi="Microsoft JhengHei" w:eastAsia="Microsoft JhengHei"/>
-          <w:sz w:val="21"/>
-        </w:rPr>
-        <w:t xml:space="preserve"> 比如說這張圖就是</w:t>
-      </w:r>
-    </w:p>
-    <w:p>
-      <w:pPr>
-        <w:pStyle w:val="ListBullet"/>
-      </w:pPr>
-      <w:r>
-        <w:rPr>
-          <w:rFonts w:ascii="Microsoft JhengHei" w:hAnsi="Microsoft JhengHei" w:eastAsia="Microsoft JhengHei"/>
-          <w:b/>
-          <w:sz w:val="21"/>
-        </w:rPr>
-        <w:t>[01:46]</w:t>
-      </w:r>
-      <w:r>
-        <w:rPr>
-          <w:rFonts w:ascii="Microsoft JhengHei" w:hAnsi="Microsoft JhengHei" w:eastAsia="Microsoft JhengHei"/>
-          <w:sz w:val="21"/>
-        </w:rPr>
-        <w:t xml:space="preserve"> 我在剛剛的投資金裡面的</w:t>
-      </w:r>
-    </w:p>
-    <w:p>
-      <w:pPr>
-        <w:pStyle w:val="ListBullet"/>
-      </w:pPr>
-      <w:r>
-        <w:rPr>
-          <w:rFonts w:ascii="Microsoft JhengHei" w:hAnsi="Microsoft JhengHei" w:eastAsia="Microsoft JhengHei"/>
-          <w:b/>
-          <w:sz w:val="21"/>
-        </w:rPr>
-        <w:t>[01:48]</w:t>
-      </w:r>
-      <w:r>
-        <w:rPr>
-          <w:rFonts w:ascii="Microsoft JhengHei" w:hAnsi="Microsoft JhengHei" w:eastAsia="Microsoft JhengHei"/>
-          <w:sz w:val="21"/>
-        </w:rPr>
-        <w:t xml:space="preserve"> 其中的一個圖表</w:t>
-      </w:r>
-    </w:p>
-    <w:p>
-      <w:pPr>
-        <w:pStyle w:val="ListBullet"/>
-      </w:pPr>
-      <w:r>
-        <w:rPr>
-          <w:rFonts w:ascii="Microsoft JhengHei" w:hAnsi="Microsoft JhengHei" w:eastAsia="Microsoft JhengHei"/>
-          <w:b/>
-          <w:sz w:val="21"/>
-        </w:rPr>
-        <w:t>[01:50]</w:t>
-      </w:r>
-      <w:r>
-        <w:rPr>
-          <w:rFonts w:ascii="Microsoft JhengHei" w:hAnsi="Microsoft JhengHei" w:eastAsia="Microsoft JhengHei"/>
-          <w:sz w:val="21"/>
-        </w:rPr>
-        <w:t xml:space="preserve"> 這是 AI 生成的文字描述</w:t>
-      </w:r>
-    </w:p>
-    <w:p>
-      <w:pPr>
-        <w:pStyle w:val="ListBullet"/>
-      </w:pPr>
-      <w:r>
-        <w:rPr>
-          <w:rFonts w:ascii="Microsoft JhengHei" w:hAnsi="Microsoft JhengHei" w:eastAsia="Microsoft JhengHei"/>
-          <w:b/>
-          <w:sz w:val="21"/>
-        </w:rPr>
-        <w:t>[01:52]</w:t>
-      </w:r>
-      <w:r>
-        <w:rPr>
-          <w:rFonts w:ascii="Microsoft JhengHei" w:hAnsi="Microsoft JhengHei" w:eastAsia="Microsoft JhengHei"/>
-          <w:sz w:val="21"/>
-        </w:rPr>
-        <w:t xml:space="preserve"> 這樣生成有什麼好處</w:t>
-      </w:r>
-    </w:p>
-    <w:p>
-      <w:pPr>
-        <w:pStyle w:val="ListBullet"/>
-      </w:pPr>
-      <w:r>
-        <w:rPr>
-          <w:rFonts w:ascii="Microsoft JhengHei" w:hAnsi="Microsoft JhengHei" w:eastAsia="Microsoft JhengHei"/>
-          <w:b/>
-          <w:sz w:val="21"/>
-        </w:rPr>
-        <w:t>[01:53]</w:t>
-      </w:r>
-      <w:r>
-        <w:rPr>
-          <w:rFonts w:ascii="Microsoft JhengHei" w:hAnsi="Microsoft JhengHei" w:eastAsia="Microsoft JhengHei"/>
-          <w:sz w:val="21"/>
-        </w:rPr>
-        <w:t xml:space="preserve"> 第一個是未來AI在查找這個知識庫的時候</w:t>
-      </w:r>
-    </w:p>
-    <w:p>
-      <w:pPr>
-        <w:pStyle w:val="ListBullet"/>
-      </w:pPr>
-      <w:r>
-        <w:rPr>
-          <w:rFonts w:ascii="Microsoft JhengHei" w:hAnsi="Microsoft JhengHei" w:eastAsia="Microsoft JhengHei"/>
-          <w:b/>
-          <w:sz w:val="21"/>
-        </w:rPr>
-        <w:t>[01:56]</w:t>
-      </w:r>
-      <w:r>
-        <w:rPr>
-          <w:rFonts w:ascii="Microsoft JhengHei" w:hAnsi="Microsoft JhengHei" w:eastAsia="Microsoft JhengHei"/>
-          <w:sz w:val="21"/>
-        </w:rPr>
-        <w:t xml:space="preserve"> 他知道有這個圖</w:t>
-      </w:r>
-    </w:p>
-    <w:p>
-      <w:pPr>
-        <w:pStyle w:val="ListBullet"/>
-      </w:pPr>
-      <w:r>
-        <w:rPr>
-          <w:rFonts w:ascii="Microsoft JhengHei" w:hAnsi="Microsoft JhengHei" w:eastAsia="Microsoft JhengHei"/>
-          <w:b/>
-          <w:sz w:val="21"/>
-        </w:rPr>
-        <w:t>[01:58]</w:t>
-      </w:r>
-      <w:r>
-        <w:rPr>
-          <w:rFonts w:ascii="Microsoft JhengHei" w:hAnsi="Microsoft JhengHei" w:eastAsia="Microsoft JhengHei"/>
-          <w:sz w:val="21"/>
-        </w:rPr>
-        <w:t xml:space="preserve"> 所以他知道要看這個章節</w:t>
-      </w:r>
-    </w:p>
-    <w:p>
-      <w:pPr>
-        <w:pStyle w:val="ListBullet"/>
-      </w:pPr>
-      <w:r>
-        <w:rPr>
-          <w:rFonts w:ascii="Microsoft JhengHei" w:hAnsi="Microsoft JhengHei" w:eastAsia="Microsoft JhengHei"/>
-          <w:b/>
-          <w:sz w:val="21"/>
-        </w:rPr>
-        <w:t>[01:59]</w:t>
-      </w:r>
-      <w:r>
-        <w:rPr>
-          <w:rFonts w:ascii="Microsoft JhengHei" w:hAnsi="Microsoft JhengHei" w:eastAsia="Microsoft JhengHei"/>
-          <w:sz w:val="21"/>
-        </w:rPr>
-        <w:t xml:space="preserve"> 第二個好處是什麼</w:t>
-      </w:r>
-    </w:p>
-    <w:p>
-      <w:pPr>
-        <w:pStyle w:val="ListBullet"/>
-      </w:pPr>
-      <w:r>
-        <w:rPr>
-          <w:rFonts w:ascii="Microsoft JhengHei" w:hAnsi="Microsoft JhengHei" w:eastAsia="Microsoft JhengHei"/>
-          <w:b/>
-          <w:sz w:val="21"/>
-        </w:rPr>
-        <w:t>[02:00]</w:t>
-      </w:r>
-      <w:r>
-        <w:rPr>
-          <w:rFonts w:ascii="Microsoft JhengHei" w:hAnsi="Microsoft JhengHei" w:eastAsia="Microsoft JhengHei"/>
-          <w:sz w:val="21"/>
-        </w:rPr>
-        <w:t xml:space="preserve"> 你可以直接拿這個文字去Gemini裡面</w:t>
-      </w:r>
-    </w:p>
-    <w:p>
-      <w:pPr>
-        <w:pStyle w:val="ListBullet"/>
-      </w:pPr>
-      <w:r>
-        <w:rPr>
-          <w:rFonts w:ascii="Microsoft JhengHei" w:hAnsi="Microsoft JhengHei" w:eastAsia="Microsoft JhengHei"/>
-          <w:b/>
-          <w:sz w:val="21"/>
-        </w:rPr>
-        <w:t>[02:04]</w:t>
-      </w:r>
-      <w:r>
-        <w:rPr>
-          <w:rFonts w:ascii="Microsoft JhengHei" w:hAnsi="Microsoft JhengHei" w:eastAsia="Microsoft JhengHei"/>
-          <w:sz w:val="21"/>
-        </w:rPr>
-        <w:t xml:space="preserve"> 再生成一張新的</w:t>
-      </w:r>
-    </w:p>
-    <w:p>
-      <w:pPr>
-        <w:pStyle w:val="ListBullet"/>
-      </w:pPr>
-      <w:r>
-        <w:rPr>
-          <w:rFonts w:ascii="Microsoft JhengHei" w:hAnsi="Microsoft JhengHei" w:eastAsia="Microsoft JhengHei"/>
-          <w:b/>
-          <w:sz w:val="21"/>
-        </w:rPr>
-        <w:t>[02:05]</w:t>
-      </w:r>
-      <w:r>
-        <w:rPr>
-          <w:rFonts w:ascii="Microsoft JhengHei" w:hAnsi="Microsoft JhengHei" w:eastAsia="Microsoft JhengHei"/>
-          <w:sz w:val="21"/>
-        </w:rPr>
-        <w:t xml:space="preserve"> 然後就可以用它剪報裡面</w:t>
-      </w:r>
-    </w:p>
-    <w:p>
-      <w:pPr>
-        <w:pStyle w:val="ListBullet"/>
-      </w:pPr>
-      <w:r>
-        <w:rPr>
-          <w:rFonts w:ascii="Microsoft JhengHei" w:hAnsi="Microsoft JhengHei" w:eastAsia="Microsoft JhengHei"/>
-          <w:b/>
-          <w:sz w:val="21"/>
-        </w:rPr>
-        <w:t>[02:07]</w:t>
-      </w:r>
-      <w:r>
-        <w:rPr>
-          <w:rFonts w:ascii="Microsoft JhengHei" w:hAnsi="Microsoft JhengHei" w:eastAsia="Microsoft JhengHei"/>
-          <w:sz w:val="21"/>
-        </w:rPr>
-        <w:t xml:space="preserve"> 不用再去截圖PDF裡面打的內容</w:t>
-      </w:r>
-    </w:p>
-    <w:p>
-      <w:pPr>
-        <w:pStyle w:val="ListBullet"/>
-      </w:pPr>
-      <w:r>
-        <w:rPr>
-          <w:rFonts w:ascii="Microsoft JhengHei" w:hAnsi="Microsoft JhengHei" w:eastAsia="Microsoft JhengHei"/>
-          <w:b/>
-          <w:sz w:val="21"/>
-        </w:rPr>
-        <w:t>[02:09]</w:t>
-      </w:r>
-      <w:r>
-        <w:rPr>
-          <w:rFonts w:ascii="Microsoft JhengHei" w:hAnsi="Microsoft JhengHei" w:eastAsia="Microsoft JhengHei"/>
-          <w:sz w:val="21"/>
-        </w:rPr>
-        <w:t xml:space="preserve"> 這是我自己在做</w:t>
+        <w:t>真正有價值的東西在哪裡，在圖上，所以你要做這個動作叫做 VLM，VLM 的動作就是，讓 AI 幫你用文字去描述一個圖，是什麼意思，比如說這張圖就是，我在剛剛的投資金裡面的，其中的一個圖表，這是 AI 生成的文字描述，這樣生成有什麼好處，第一個是未來AI在查找這個知識庫的時候，他知道有這個圖，所以他知道要看這個章節，第二個好處是什麼，你可以直接拿這個文字去Gemini裡面，再生成一張新的，然後就可以用它剪報裡面，不用再去截圖PDF裡面打的內容，這是我自己在做。</w:t>
       </w:r>
     </w:p>
     <w:p>
@@ -2525,7 +1310,7 @@
         <w:pStyle w:val="Heading3"/>
       </w:pPr>
       <w:r>
-        <w:t>[02:10] 畫面</w:t>
+        <w:t>畫面 02:10–02:15</w:t>
       </w:r>
     </w:p>
     <w:p>
@@ -2568,63 +1353,12 @@
       </w:r>
     </w:p>
     <w:p>
-      <w:pPr>
-        <w:pStyle w:val="ListBullet"/>
-      </w:pPr>
-      <w:r>
-        <w:rPr>
-          <w:rFonts w:ascii="Microsoft JhengHei" w:hAnsi="Microsoft JhengHei" w:eastAsia="Microsoft JhengHei"/>
-          <w:b/>
-          <w:sz w:val="21"/>
-        </w:rPr>
-        <w:t>[02:10]</w:t>
-      </w:r>
       <w:r>
         <w:rPr>
           <w:rFonts w:ascii="Microsoft JhengHei" w:hAnsi="Microsoft JhengHei" w:eastAsia="Microsoft JhengHei"/>
           <w:sz w:val="21"/>
         </w:rPr>
-        <w:t xml:space="preserve"> 我自己的AI的知識庫的流程</w:t>
-      </w:r>
-    </w:p>
-    <w:p>
-      <w:pPr>
-        <w:pStyle w:val="ListBullet"/>
-      </w:pPr>
-      <w:r>
-        <w:rPr>
-          <w:rFonts w:ascii="Microsoft JhengHei" w:hAnsi="Microsoft JhengHei" w:eastAsia="Microsoft JhengHei"/>
-          <w:b/>
-          <w:sz w:val="21"/>
-        </w:rPr>
-        <w:t>[02:13]</w:t>
-      </w:r>
-      <w:r>
-        <w:rPr>
-          <w:rFonts w:ascii="Microsoft JhengHei" w:hAnsi="Microsoft JhengHei" w:eastAsia="Microsoft JhengHei"/>
-          <w:sz w:val="21"/>
-        </w:rPr>
-        <w:t xml:space="preserve"> 我至少做了六個步驟</w:t>
-      </w:r>
-    </w:p>
-    <w:p>
-      <w:pPr>
-        <w:pStyle w:val="ListBullet"/>
-      </w:pPr>
-      <w:r>
-        <w:rPr>
-          <w:rFonts w:ascii="Microsoft JhengHei" w:hAnsi="Microsoft JhengHei" w:eastAsia="Microsoft JhengHei"/>
-          <w:b/>
-          <w:sz w:val="21"/>
-        </w:rPr>
-        <w:t>[02:14]</w:t>
-      </w:r>
-      <w:r>
-        <w:rPr>
-          <w:rFonts w:ascii="Microsoft JhengHei" w:hAnsi="Microsoft JhengHei" w:eastAsia="Microsoft JhengHei"/>
-          <w:sz w:val="21"/>
-        </w:rPr>
-        <w:t xml:space="preserve"> 第一步新手做的翻譯格詞</w:t>
+        <w:t>我自己的AI的知識庫的流程，我至少做了六個步驟，第一步新手做的翻譯格詞。</w:t>
       </w:r>
     </w:p>
     <w:p>
@@ -2632,7 +1366,7 @@
         <w:pStyle w:val="Heading3"/>
       </w:pPr>
       <w:r>
-        <w:t>[02:15] 畫面</w:t>
+        <w:t>畫面 02:15–02:44</w:t>
       </w:r>
     </w:p>
     <w:p>
@@ -2675,343 +1409,12 @@
       </w:r>
     </w:p>
     <w:p>
-      <w:pPr>
-        <w:pStyle w:val="ListBullet"/>
-      </w:pPr>
-      <w:r>
-        <w:rPr>
-          <w:rFonts w:ascii="Microsoft JhengHei" w:hAnsi="Microsoft JhengHei" w:eastAsia="Microsoft JhengHei"/>
-          <w:b/>
-          <w:sz w:val="21"/>
-        </w:rPr>
-        <w:t>[02:15]</w:t>
-      </w:r>
       <w:r>
         <w:rPr>
           <w:rFonts w:ascii="Microsoft JhengHei" w:hAnsi="Microsoft JhengHei" w:eastAsia="Microsoft JhengHei"/>
           <w:sz w:val="21"/>
         </w:rPr>
-        <w:t xml:space="preserve"> 先讓AI看得懂我給他的東西</w:t>
-      </w:r>
-    </w:p>
-    <w:p>
-      <w:pPr>
-        <w:pStyle w:val="ListBullet"/>
-      </w:pPr>
-      <w:r>
-        <w:rPr>
-          <w:rFonts w:ascii="Microsoft JhengHei" w:hAnsi="Microsoft JhengHei" w:eastAsia="Microsoft JhengHei"/>
-          <w:b/>
-          <w:sz w:val="21"/>
-        </w:rPr>
-        <w:t>[02:17]</w:t>
-      </w:r>
-      <w:r>
-        <w:rPr>
-          <w:rFonts w:ascii="Microsoft JhengHei" w:hAnsi="Microsoft JhengHei" w:eastAsia="Microsoft JhengHei"/>
-          <w:sz w:val="21"/>
-        </w:rPr>
-        <w:t xml:space="preserve"> 翻譯成Markdown檔</w:t>
-      </w:r>
-    </w:p>
-    <w:p>
-      <w:pPr>
-        <w:pStyle w:val="ListBullet"/>
-      </w:pPr>
-      <w:r>
-        <w:rPr>
-          <w:rFonts w:ascii="Microsoft JhengHei" w:hAnsi="Microsoft JhengHei" w:eastAsia="Microsoft JhengHei"/>
-          <w:b/>
-          <w:sz w:val="21"/>
-        </w:rPr>
-        <w:t>[02:19]</w:t>
-      </w:r>
-      <w:r>
-        <w:rPr>
-          <w:rFonts w:ascii="Microsoft JhengHei" w:hAnsi="Microsoft JhengHei" w:eastAsia="Microsoft JhengHei"/>
-          <w:sz w:val="21"/>
-        </w:rPr>
-        <w:t xml:space="preserve"> 然後我要建立個別的知識庫</w:t>
-      </w:r>
-    </w:p>
-    <w:p>
-      <w:pPr>
-        <w:pStyle w:val="ListBullet"/>
-      </w:pPr>
-      <w:r>
-        <w:rPr>
-          <w:rFonts w:ascii="Microsoft JhengHei" w:hAnsi="Microsoft JhengHei" w:eastAsia="Microsoft JhengHei"/>
-          <w:b/>
-          <w:sz w:val="21"/>
-        </w:rPr>
-        <w:t>[02:21]</w:t>
-      </w:r>
-      <w:r>
-        <w:rPr>
-          <w:rFonts w:ascii="Microsoft JhengHei" w:hAnsi="Microsoft JhengHei" w:eastAsia="Microsoft JhengHei"/>
-          <w:sz w:val="21"/>
-        </w:rPr>
-        <w:t xml:space="preserve"> 然後每個知識庫</w:t>
-      </w:r>
-    </w:p>
-    <w:p>
-      <w:pPr>
-        <w:pStyle w:val="ListBullet"/>
-      </w:pPr>
-      <w:r>
-        <w:rPr>
-          <w:rFonts w:ascii="Microsoft JhengHei" w:hAnsi="Microsoft JhengHei" w:eastAsia="Microsoft JhengHei"/>
-          <w:b/>
-          <w:sz w:val="21"/>
-        </w:rPr>
-        <w:t>[02:22]</w:t>
-      </w:r>
-      <w:r>
-        <w:rPr>
-          <w:rFonts w:ascii="Microsoft JhengHei" w:hAnsi="Microsoft JhengHei" w:eastAsia="Microsoft JhengHei"/>
-          <w:sz w:val="21"/>
-        </w:rPr>
-        <w:t xml:space="preserve"> 還會再做一層案例的萃取</w:t>
-      </w:r>
-    </w:p>
-    <w:p>
-      <w:pPr>
-        <w:pStyle w:val="ListBullet"/>
-      </w:pPr>
-      <w:r>
-        <w:rPr>
-          <w:rFonts w:ascii="Microsoft JhengHei" w:hAnsi="Microsoft JhengHei" w:eastAsia="Microsoft JhengHei"/>
-          <w:b/>
-          <w:sz w:val="21"/>
-        </w:rPr>
-        <w:t>[02:24]</w:t>
-      </w:r>
-      <w:r>
-        <w:rPr>
-          <w:rFonts w:ascii="Microsoft JhengHei" w:hAnsi="Microsoft JhengHei" w:eastAsia="Microsoft JhengHei"/>
-          <w:sz w:val="21"/>
-        </w:rPr>
-        <w:t xml:space="preserve"> 比如說把剛剛的那個</w:t>
-      </w:r>
-    </w:p>
-    <w:p>
-      <w:pPr>
-        <w:pStyle w:val="ListBullet"/>
-      </w:pPr>
-      <w:r>
-        <w:rPr>
-          <w:rFonts w:ascii="Microsoft JhengHei" w:hAnsi="Microsoft JhengHei" w:eastAsia="Microsoft JhengHei"/>
-          <w:b/>
-          <w:sz w:val="21"/>
-        </w:rPr>
-        <w:t>[02:25]</w:t>
-      </w:r>
-      <w:r>
-        <w:rPr>
-          <w:rFonts w:ascii="Microsoft JhengHei" w:hAnsi="Microsoft JhengHei" w:eastAsia="Microsoft JhengHei"/>
-          <w:sz w:val="21"/>
-        </w:rPr>
-        <w:t xml:space="preserve"> 投資金域這本書</w:t>
-      </w:r>
-    </w:p>
-    <w:p>
-      <w:pPr>
-        <w:pStyle w:val="ListBullet"/>
-      </w:pPr>
-      <w:r>
-        <w:rPr>
-          <w:rFonts w:ascii="Microsoft JhengHei" w:hAnsi="Microsoft JhengHei" w:eastAsia="Microsoft JhengHei"/>
-          <w:b/>
-          <w:sz w:val="21"/>
-        </w:rPr>
-        <w:t>[02:26]</w:t>
-      </w:r>
-      <w:r>
-        <w:rPr>
-          <w:rFonts w:ascii="Microsoft JhengHei" w:hAnsi="Microsoft JhengHei" w:eastAsia="Microsoft JhengHei"/>
-          <w:sz w:val="21"/>
-        </w:rPr>
-        <w:t xml:space="preserve"> 來做成一個投資金域的案例</w:t>
-      </w:r>
-    </w:p>
-    <w:p>
-      <w:pPr>
-        <w:pStyle w:val="ListBullet"/>
-      </w:pPr>
-      <w:r>
-        <w:rPr>
-          <w:rFonts w:ascii="Microsoft JhengHei" w:hAnsi="Microsoft JhengHei" w:eastAsia="Microsoft JhengHei"/>
-          <w:b/>
-          <w:sz w:val="21"/>
-        </w:rPr>
-        <w:t>[02:28]</w:t>
-      </w:r>
-      <w:r>
-        <w:rPr>
-          <w:rFonts w:ascii="Microsoft JhengHei" w:hAnsi="Microsoft JhengHei" w:eastAsia="Microsoft JhengHei"/>
-          <w:sz w:val="21"/>
-        </w:rPr>
-        <w:t xml:space="preserve"> 精選案例另外一個知識庫</w:t>
-      </w:r>
-    </w:p>
-    <w:p>
-      <w:pPr>
-        <w:pStyle w:val="ListBullet"/>
-      </w:pPr>
-      <w:r>
-        <w:rPr>
-          <w:rFonts w:ascii="Microsoft JhengHei" w:hAnsi="Microsoft JhengHei" w:eastAsia="Microsoft JhengHei"/>
-          <w:b/>
-          <w:sz w:val="21"/>
-        </w:rPr>
-        <w:t>[02:30]</w:t>
-      </w:r>
-      <w:r>
-        <w:rPr>
-          <w:rFonts w:ascii="Microsoft JhengHei" w:hAnsi="Microsoft JhengHei" w:eastAsia="Microsoft JhengHei"/>
-          <w:sz w:val="21"/>
-        </w:rPr>
-        <w:t xml:space="preserve"> 然後我再做任何搜尋</w:t>
-      </w:r>
-    </w:p>
-    <w:p>
-      <w:pPr>
-        <w:pStyle w:val="ListBullet"/>
-      </w:pPr>
-      <w:r>
-        <w:rPr>
-          <w:rFonts w:ascii="Microsoft JhengHei" w:hAnsi="Microsoft JhengHei" w:eastAsia="Microsoft JhengHei"/>
-          <w:b/>
-          <w:sz w:val="21"/>
-        </w:rPr>
-        <w:t>[02:31]</w:t>
-      </w:r>
-      <w:r>
-        <w:rPr>
-          <w:rFonts w:ascii="Microsoft JhengHei" w:hAnsi="Microsoft JhengHei" w:eastAsia="Microsoft JhengHei"/>
-          <w:sz w:val="21"/>
-        </w:rPr>
-        <w:t xml:space="preserve"> 都會先看那個精選案例</w:t>
-      </w:r>
-    </w:p>
-    <w:p>
-      <w:pPr>
-        <w:pStyle w:val="ListBullet"/>
-      </w:pPr>
-      <w:r>
-        <w:rPr>
-          <w:rFonts w:ascii="Microsoft JhengHei" w:hAnsi="Microsoft JhengHei" w:eastAsia="Microsoft JhengHei"/>
-          <w:b/>
-          <w:sz w:val="21"/>
-        </w:rPr>
-        <w:t>[02:33]</w:t>
-      </w:r>
-      <w:r>
-        <w:rPr>
-          <w:rFonts w:ascii="Microsoft JhengHei" w:hAnsi="Microsoft JhengHei" w:eastAsia="Microsoft JhengHei"/>
-          <w:sz w:val="21"/>
-        </w:rPr>
-        <w:t xml:space="preserve"> 再回去看原文</w:t>
-      </w:r>
-    </w:p>
-    <w:p>
-      <w:pPr>
-        <w:pStyle w:val="ListBullet"/>
-      </w:pPr>
-      <w:r>
-        <w:rPr>
-          <w:rFonts w:ascii="Microsoft JhengHei" w:hAnsi="Microsoft JhengHei" w:eastAsia="Microsoft JhengHei"/>
-          <w:b/>
-          <w:sz w:val="21"/>
-        </w:rPr>
-        <w:t>[02:34]</w:t>
-      </w:r>
-      <w:r>
-        <w:rPr>
-          <w:rFonts w:ascii="Microsoft JhengHei" w:hAnsi="Microsoft JhengHei" w:eastAsia="Microsoft JhengHei"/>
-          <w:sz w:val="21"/>
-        </w:rPr>
-        <w:t xml:space="preserve"> 然後我會做這兩個的溯源連結</w:t>
-      </w:r>
-    </w:p>
-    <w:p>
-      <w:pPr>
-        <w:pStyle w:val="ListBullet"/>
-      </w:pPr>
-      <w:r>
-        <w:rPr>
-          <w:rFonts w:ascii="Microsoft JhengHei" w:hAnsi="Microsoft JhengHei" w:eastAsia="Microsoft JhengHei"/>
-          <w:b/>
-          <w:sz w:val="21"/>
-        </w:rPr>
-        <w:t>[02:36]</w:t>
-      </w:r>
-      <w:r>
-        <w:rPr>
-          <w:rFonts w:ascii="Microsoft JhengHei" w:hAnsi="Microsoft JhengHei" w:eastAsia="Microsoft JhengHei"/>
-          <w:sz w:val="21"/>
-        </w:rPr>
-        <w:t xml:space="preserve"> 所以我在精選案例裡面的任何內容</w:t>
-      </w:r>
-    </w:p>
-    <w:p>
-      <w:pPr>
-        <w:pStyle w:val="ListBullet"/>
-      </w:pPr>
-      <w:r>
-        <w:rPr>
-          <w:rFonts w:ascii="Microsoft JhengHei" w:hAnsi="Microsoft JhengHei" w:eastAsia="Microsoft JhengHei"/>
-          <w:b/>
-          <w:sz w:val="21"/>
-        </w:rPr>
-        <w:t>[02:39]</w:t>
-      </w:r>
-      <w:r>
-        <w:rPr>
-          <w:rFonts w:ascii="Microsoft JhengHei" w:hAnsi="Microsoft JhengHei" w:eastAsia="Microsoft JhengHei"/>
-          <w:sz w:val="21"/>
-        </w:rPr>
-        <w:t xml:space="preserve"> 都可以隨時找到</w:t>
-      </w:r>
-    </w:p>
-    <w:p>
-      <w:pPr>
-        <w:pStyle w:val="ListBullet"/>
-      </w:pPr>
-      <w:r>
-        <w:rPr>
-          <w:rFonts w:ascii="Microsoft JhengHei" w:hAnsi="Microsoft JhengHei" w:eastAsia="Microsoft JhengHei"/>
-          <w:b/>
-          <w:sz w:val="21"/>
-        </w:rPr>
-        <w:t>[02:40]</w:t>
-      </w:r>
-      <w:r>
-        <w:rPr>
-          <w:rFonts w:ascii="Microsoft JhengHei" w:hAnsi="Microsoft JhengHei" w:eastAsia="Microsoft JhengHei"/>
-          <w:sz w:val="21"/>
-        </w:rPr>
-        <w:t xml:space="preserve"> 那個原文裡面在哪一個章節</w:t>
-      </w:r>
-    </w:p>
-    <w:p>
-      <w:pPr>
-        <w:pStyle w:val="ListBullet"/>
-      </w:pPr>
-      <w:r>
-        <w:rPr>
-          <w:rFonts w:ascii="Microsoft JhengHei" w:hAnsi="Microsoft JhengHei" w:eastAsia="Microsoft JhengHei"/>
-          <w:b/>
-          <w:sz w:val="21"/>
-        </w:rPr>
-        <w:t>[02:42]</w:t>
-      </w:r>
-      <w:r>
-        <w:rPr>
-          <w:rFonts w:ascii="Microsoft JhengHei" w:hAnsi="Microsoft JhengHei" w:eastAsia="Microsoft JhengHei"/>
-          <w:sz w:val="21"/>
-        </w:rPr>
-        <w:t xml:space="preserve"> 然後再透過兩個層次的搜尋</w:t>
+        <w:t>先讓AI看得懂我給他的東西，翻譯成Markdown檔，然後我要建立個別的知識庫，然後每個知識庫，還會再做一層案例的萃取，比如說把剛剛的那個，投資金域這本書，來做成一個投資金域的案例，精選案例另外一個知識庫，然後我再做任何搜尋，都會先看那個精選案例，再回去看原文，然後我會做這兩個的溯源連結，所以我在精選案例裡面的任何內容，都可以隨時找到，那個原文裡面在哪一個章節，然後再透過兩個層次的搜尋。</w:t>
       </w:r>
     </w:p>
     <w:p>
@@ -3019,7 +1422,7 @@
         <w:pStyle w:val="Heading3"/>
       </w:pPr>
       <w:r>
-        <w:t>[02:44] 畫面</w:t>
+        <w:t>畫面 02:44–02:50</w:t>
       </w:r>
     </w:p>
     <w:p>
@@ -3062,63 +1465,12 @@
       </w:r>
     </w:p>
     <w:p>
-      <w:pPr>
-        <w:pStyle w:val="ListBullet"/>
-      </w:pPr>
-      <w:r>
-        <w:rPr>
-          <w:rFonts w:ascii="Microsoft JhengHei" w:hAnsi="Microsoft JhengHei" w:eastAsia="Microsoft JhengHei"/>
-          <w:b/>
-          <w:sz w:val="21"/>
-        </w:rPr>
-        <w:t>[02:45]</w:t>
-      </w:r>
       <w:r>
         <w:rPr>
           <w:rFonts w:ascii="Microsoft JhengHei" w:hAnsi="Microsoft JhengHei" w:eastAsia="Microsoft JhengHei"/>
           <w:sz w:val="21"/>
         </w:rPr>
-        <w:t xml:space="preserve"> 透過關鍵字跟透過寓意搜尋</w:t>
-      </w:r>
-    </w:p>
-    <w:p>
-      <w:pPr>
-        <w:pStyle w:val="ListBullet"/>
-      </w:pPr>
-      <w:r>
-        <w:rPr>
-          <w:rFonts w:ascii="Microsoft JhengHei" w:hAnsi="Microsoft JhengHei" w:eastAsia="Microsoft JhengHei"/>
-          <w:b/>
-          <w:sz w:val="21"/>
-        </w:rPr>
-        <w:t>[02:47]</w:t>
-      </w:r>
-      <w:r>
-        <w:rPr>
-          <w:rFonts w:ascii="Microsoft JhengHei" w:hAnsi="Microsoft JhengHei" w:eastAsia="Microsoft JhengHei"/>
-          <w:sz w:val="21"/>
-        </w:rPr>
-        <w:t xml:space="preserve"> 去得到我想要的東西</w:t>
-      </w:r>
-    </w:p>
-    <w:p>
-      <w:pPr>
-        <w:pStyle w:val="ListBullet"/>
-      </w:pPr>
-      <w:r>
-        <w:rPr>
-          <w:rFonts w:ascii="Microsoft JhengHei" w:hAnsi="Microsoft JhengHei" w:eastAsia="Microsoft JhengHei"/>
-          <w:b/>
-          <w:sz w:val="21"/>
-        </w:rPr>
-        <w:t>[02:49]</w:t>
-      </w:r>
-      <w:r>
-        <w:rPr>
-          <w:rFonts w:ascii="Microsoft JhengHei" w:hAnsi="Microsoft JhengHei" w:eastAsia="Microsoft JhengHei"/>
-          <w:sz w:val="21"/>
-        </w:rPr>
-        <w:t xml:space="preserve"> 我知道那個大部分的新手</w:t>
+        <w:t>透過關鍵字跟透過寓意搜尋，去得到我想要的東西，我知道那個大部分的新手。</w:t>
       </w:r>
     </w:p>
     <w:p>
@@ -3126,7 +1478,7 @@
         <w:pStyle w:val="Heading3"/>
       </w:pPr>
       <w:r>
-        <w:t>[02:50] 畫面</w:t>
+        <w:t>畫面 02:50–03:01</w:t>
       </w:r>
     </w:p>
     <w:p>
@@ -3169,143 +1521,12 @@
       </w:r>
     </w:p>
     <w:p>
-      <w:pPr>
-        <w:pStyle w:val="ListBullet"/>
-      </w:pPr>
-      <w:r>
-        <w:rPr>
-          <w:rFonts w:ascii="Microsoft JhengHei" w:hAnsi="Microsoft JhengHei" w:eastAsia="Microsoft JhengHei"/>
-          <w:b/>
-          <w:sz w:val="21"/>
-        </w:rPr>
-        <w:t>[02:50]</w:t>
-      </w:r>
       <w:r>
         <w:rPr>
           <w:rFonts w:ascii="Microsoft JhengHei" w:hAnsi="Microsoft JhengHei" w:eastAsia="Microsoft JhengHei"/>
           <w:sz w:val="21"/>
         </w:rPr>
-        <w:t xml:space="preserve"> 我聽到這邊已經通告已經花了</w:t>
-      </w:r>
-    </w:p>
-    <w:p>
-      <w:pPr>
-        <w:pStyle w:val="ListBullet"/>
-      </w:pPr>
-      <w:r>
-        <w:rPr>
-          <w:rFonts w:ascii="Microsoft JhengHei" w:hAnsi="Microsoft JhengHei" w:eastAsia="Microsoft JhengHei"/>
-          <w:b/>
-          <w:sz w:val="21"/>
-        </w:rPr>
-        <w:t>[02:52]</w:t>
-      </w:r>
-      <w:r>
-        <w:rPr>
-          <w:rFonts w:ascii="Microsoft JhengHei" w:hAnsi="Microsoft JhengHei" w:eastAsia="Microsoft JhengHei"/>
-          <w:sz w:val="21"/>
-        </w:rPr>
-        <w:t xml:space="preserve"> 沒有關係</w:t>
-      </w:r>
-    </w:p>
-    <w:p>
-      <w:pPr>
-        <w:pStyle w:val="ListBullet"/>
-      </w:pPr>
-      <w:r>
-        <w:rPr>
-          <w:rFonts w:ascii="Microsoft JhengHei" w:hAnsi="Microsoft JhengHei" w:eastAsia="Microsoft JhengHei"/>
-          <w:b/>
-          <w:sz w:val="21"/>
-        </w:rPr>
-        <w:t>[02:53]</w:t>
-      </w:r>
-      <w:r>
-        <w:rPr>
-          <w:rFonts w:ascii="Microsoft JhengHei" w:hAnsi="Microsoft JhengHei" w:eastAsia="Microsoft JhengHei"/>
-          <w:sz w:val="21"/>
-        </w:rPr>
-        <w:t xml:space="preserve"> 這部分呢</w:t>
-      </w:r>
-    </w:p>
-    <w:p>
-      <w:pPr>
-        <w:pStyle w:val="ListBullet"/>
-      </w:pPr>
-      <w:r>
-        <w:rPr>
-          <w:rFonts w:ascii="Microsoft JhengHei" w:hAnsi="Microsoft JhengHei" w:eastAsia="Microsoft JhengHei"/>
-          <w:b/>
-          <w:sz w:val="21"/>
-        </w:rPr>
-        <w:t>[02:54]</w:t>
-      </w:r>
-      <w:r>
-        <w:rPr>
-          <w:rFonts w:ascii="Microsoft JhengHei" w:hAnsi="Microsoft JhengHei" w:eastAsia="Microsoft JhengHei"/>
-          <w:sz w:val="21"/>
-        </w:rPr>
-        <w:t xml:space="preserve"> 因為比較進階</w:t>
-      </w:r>
-    </w:p>
-    <w:p>
-      <w:pPr>
-        <w:pStyle w:val="ListBullet"/>
-      </w:pPr>
-      <w:r>
-        <w:rPr>
-          <w:rFonts w:ascii="Microsoft JhengHei" w:hAnsi="Microsoft JhengHei" w:eastAsia="Microsoft JhengHei"/>
-          <w:b/>
-          <w:sz w:val="21"/>
-        </w:rPr>
-        <w:t>[02:55]</w:t>
-      </w:r>
-      <w:r>
-        <w:rPr>
-          <w:rFonts w:ascii="Microsoft JhengHei" w:hAnsi="Microsoft JhengHei" w:eastAsia="Microsoft JhengHei"/>
-          <w:sz w:val="21"/>
-        </w:rPr>
-        <w:t xml:space="preserve"> 我們會在後續課程裡面的直播裡面</w:t>
-      </w:r>
-    </w:p>
-    <w:p>
-      <w:pPr>
-        <w:pStyle w:val="ListBullet"/>
-      </w:pPr>
-      <w:r>
-        <w:rPr>
-          <w:rFonts w:ascii="Microsoft JhengHei" w:hAnsi="Microsoft JhengHei" w:eastAsia="Microsoft JhengHei"/>
-          <w:b/>
-          <w:sz w:val="21"/>
-        </w:rPr>
-        <w:t>[02:58]</w:t>
-      </w:r>
-      <w:r>
-        <w:rPr>
-          <w:rFonts w:ascii="Microsoft JhengHei" w:hAnsi="Microsoft JhengHei" w:eastAsia="Microsoft JhengHei"/>
-          <w:sz w:val="21"/>
-        </w:rPr>
-        <w:t xml:space="preserve"> 慢慢跟大家分享</w:t>
-      </w:r>
-    </w:p>
-    <w:p>
-      <w:pPr>
-        <w:pStyle w:val="ListBullet"/>
-      </w:pPr>
-      <w:r>
-        <w:rPr>
-          <w:rFonts w:ascii="Microsoft JhengHei" w:hAnsi="Microsoft JhengHei" w:eastAsia="Microsoft JhengHei"/>
-          <w:b/>
-          <w:sz w:val="21"/>
-        </w:rPr>
-        <w:t>[02:59]</w:t>
-      </w:r>
-      <w:r>
-        <w:rPr>
-          <w:rFonts w:ascii="Microsoft JhengHei" w:hAnsi="Microsoft JhengHei" w:eastAsia="Microsoft JhengHei"/>
-          <w:sz w:val="21"/>
-        </w:rPr>
-        <w:t xml:space="preserve"> 最好的解決方法</w:t>
+        <w:t>我聽到這邊已經通告已經花了，沒有關係，這部分呢，因為比較進階，我們會在後續課程裡面的直播裡面，慢慢跟大家分享，最好的解決方法。</w:t>
       </w:r>
     </w:p>
     <w:p>
@@ -3478,7 +1699,7 @@
                 <w:rFonts w:ascii="Microsoft JhengHei" w:hAnsi="Microsoft JhengHei" w:eastAsia="Microsoft JhengHei"/>
                 <w:sz w:val="19"/>
               </w:rPr>
-              <w:t>書名未確認</w:t>
+              <w:t>投資金律（書名，依畫面確認）</w:t>
             </w:r>
           </w:p>
         </w:tc>

</xml_diff>

<commit_message>
Report: add keyword tags (document and per-section), stored in meta.json
Co-Authored-By: Claude Sonnet 5.5 <noreply@anthropic.com>
Claude-Session: https://claude.ai/code/session_01AU333YXvwcrS2oXycGABJ3
</commit_message>
<xml_diff>
--- a/watch-output/2026-10-11_Facebook_不要再把PDF直接丟給AI-多做這3步品質差很多-AI超級大腦2小時線上講座__1Bggy9HRKs/report.docx
+++ b/watch-output/2026-10-11_Facebook_不要再把PDF直接丟給AI-多做這3步品質差很多-AI超級大腦2小時線上講座__1Bggy9HRKs/report.docx
@@ -68,6 +68,26 @@
           <w:sz w:val="21"/>
         </w:rPr>
         <w:t>更新日期：2026-10-11</w:t>
+      </w:r>
+    </w:p>
+    <w:p>
+      <w:pPr>
+        <w:pStyle w:val="ListBullet"/>
+      </w:pPr>
+      <w:r>
+        <w:rPr>
+          <w:rFonts w:ascii="Microsoft JhengHei" w:hAnsi="Microsoft JhengHei" w:eastAsia="Microsoft JhengHei"/>
+          <w:b/>
+          <w:sz w:val="21"/>
+        </w:rPr>
+        <w:t>關鍵字：</w:t>
+      </w:r>
+      <w:r>
+        <w:rPr>
+          <w:rFonts w:ascii="Microsoft JhengHei" w:hAnsi="Microsoft JhengHei" w:eastAsia="Microsoft JhengHei"/>
+          <w:sz w:val="21"/>
+        </w:rPr>
+        <w:t xml:space="preserve"> #AI知識庫 #PDF #Markdown #VLM #上下文限制 #章節摘要索引 #語意搜尋 #溯源連結 #投資金律</w:t>
       </w:r>
     </w:p>
     <w:p>
@@ -1076,6 +1096,23 @@
       <w:r>
         <w:rPr>
           <w:rFonts w:ascii="Microsoft JhengHei" w:hAnsi="Microsoft JhengHei" w:eastAsia="Microsoft JhengHei"/>
+          <w:b/>
+          <w:sz w:val="21"/>
+        </w:rPr>
+        <w:t>標籤：</w:t>
+      </w:r>
+      <w:r>
+        <w:rPr>
+          <w:rFonts w:ascii="Microsoft JhengHei" w:hAnsi="Microsoft JhengHei" w:eastAsia="Microsoft JhengHei"/>
+          <w:sz w:val="21"/>
+        </w:rPr>
+        <w:t xml:space="preserve"> #AI知識庫 #PDF #投資金律</w:t>
+      </w:r>
+    </w:p>
+    <w:p>
+      <w:r>
+        <w:rPr>
+          <w:rFonts w:ascii="Microsoft JhengHei" w:hAnsi="Microsoft JhengHei" w:eastAsia="Microsoft JhengHei"/>
           <w:sz w:val="21"/>
         </w:rPr>
         <w:t>如果你想要把這本書變成你的AI知識庫，你會怎麼做，大多數的人都會直接把PDF整個上傳的人，你會發現AI回憶的東西好像不像作者寫的，而且你問他很多書語的細節，AI都找不到。</w:t>
@@ -1126,6 +1163,23 @@
             </a:graphic>
           </wp:inline>
         </w:drawing>
+      </w:r>
+    </w:p>
+    <w:p>
+      <w:r>
+        <w:rPr>
+          <w:rFonts w:ascii="Microsoft JhengHei" w:hAnsi="Microsoft JhengHei" w:eastAsia="Microsoft JhengHei"/>
+          <w:b/>
+          <w:sz w:val="21"/>
+        </w:rPr>
+        <w:t>標籤：</w:t>
+      </w:r>
+      <w:r>
+        <w:rPr>
+          <w:rFonts w:ascii="Microsoft JhengHei" w:hAnsi="Microsoft JhengHei" w:eastAsia="Microsoft JhengHei"/>
+          <w:sz w:val="21"/>
+        </w:rPr>
+        <w:t xml:space="preserve"> #上下文限制 #格式限制 #理解限制</w:t>
       </w:r>
     </w:p>
     <w:p>
@@ -1188,6 +1242,23 @@
       <w:r>
         <w:rPr>
           <w:rFonts w:ascii="Microsoft JhengHei" w:hAnsi="Microsoft JhengHei" w:eastAsia="Microsoft JhengHei"/>
+          <w:b/>
+          <w:sz w:val="21"/>
+        </w:rPr>
+        <w:t>標籤：</w:t>
+      </w:r>
+      <w:r>
+        <w:rPr>
+          <w:rFonts w:ascii="Microsoft JhengHei" w:hAnsi="Microsoft JhengHei" w:eastAsia="Microsoft JhengHei"/>
+          <w:sz w:val="21"/>
+        </w:rPr>
+        <w:t xml:space="preserve"> #Markdown #PDF轉換</w:t>
+      </w:r>
+    </w:p>
+    <w:p>
+      <w:r>
+        <w:rPr>
+          <w:rFonts w:ascii="Microsoft JhengHei" w:hAnsi="Microsoft JhengHei" w:eastAsia="Microsoft JhengHei"/>
           <w:sz w:val="21"/>
         </w:rPr>
         <w:t>懂得怎麼把PDF轉成Markdown這個格式，這兩個檔名最大的差別是什麼呢，PDF是一種被封裝好的閱讀結果，它是幫你設計好，給人類看起來很舒服的版面，但是Markdown的格式才是可以被機器理解的結構化知識，如果你給PDF的話，他看不到他的標題，看不到他的結構，但在Markdown裡面可以。</w:t>
@@ -1238,6 +1309,23 @@
             </a:graphic>
           </wp:inline>
         </w:drawing>
+      </w:r>
+    </w:p>
+    <w:p>
+      <w:r>
+        <w:rPr>
+          <w:rFonts w:ascii="Microsoft JhengHei" w:hAnsi="Microsoft JhengHei" w:eastAsia="Microsoft JhengHei"/>
+          <w:b/>
+          <w:sz w:val="21"/>
+        </w:rPr>
+        <w:t>標籤：</w:t>
+      </w:r>
+      <w:r>
+        <w:rPr>
+          <w:rFonts w:ascii="Microsoft JhengHei" w:hAnsi="Microsoft JhengHei" w:eastAsia="Microsoft JhengHei"/>
+          <w:sz w:val="21"/>
+        </w:rPr>
+        <w:t xml:space="preserve"> #章節摘要 #關鍵詞 #索引</w:t>
       </w:r>
     </w:p>
     <w:p>
@@ -1300,6 +1388,23 @@
       <w:r>
         <w:rPr>
           <w:rFonts w:ascii="Microsoft JhengHei" w:hAnsi="Microsoft JhengHei" w:eastAsia="Microsoft JhengHei"/>
+          <w:b/>
+          <w:sz w:val="21"/>
+        </w:rPr>
+        <w:t>標籤：</w:t>
+      </w:r>
+      <w:r>
+        <w:rPr>
+          <w:rFonts w:ascii="Microsoft JhengHei" w:hAnsi="Microsoft JhengHei" w:eastAsia="Microsoft JhengHei"/>
+          <w:sz w:val="21"/>
+        </w:rPr>
+        <w:t xml:space="preserve"> #VLM #圖表轉文字</w:t>
+      </w:r>
+    </w:p>
+    <w:p>
+      <w:r>
+        <w:rPr>
+          <w:rFonts w:ascii="Microsoft JhengHei" w:hAnsi="Microsoft JhengHei" w:eastAsia="Microsoft JhengHei"/>
           <w:sz w:val="21"/>
         </w:rPr>
         <w:t>真正有價值的東西在哪裡，在圖上，所以你要做這個動作叫做 VLM，VLM 的動作就是，讓 AI 幫你用文字去描述一個圖，是什麼意思，比如說這張圖就是，我在剛剛的投資金裡面的，其中的一個圖表，這是 AI 生成的文字描述，這樣生成有什麼好處，第一個是未來AI在查找這個知識庫的時候，他知道有這個圖，所以他知道要看這個章節，第二個好處是什麼，你可以直接拿這個文字去Gemini裡面，再生成一張新的，然後就可以用它剪報裡面，不用再去截圖PDF裡面打的內容，這是我自己在做。</w:t>
@@ -1350,6 +1455,23 @@
             </a:graphic>
           </wp:inline>
         </w:drawing>
+      </w:r>
+    </w:p>
+    <w:p>
+      <w:r>
+        <w:rPr>
+          <w:rFonts w:ascii="Microsoft JhengHei" w:hAnsi="Microsoft JhengHei" w:eastAsia="Microsoft JhengHei"/>
+          <w:b/>
+          <w:sz w:val="21"/>
+        </w:rPr>
+        <w:t>標籤：</w:t>
+      </w:r>
+      <w:r>
+        <w:rPr>
+          <w:rFonts w:ascii="Microsoft JhengHei" w:hAnsi="Microsoft JhengHei" w:eastAsia="Microsoft JhengHei"/>
+          <w:sz w:val="21"/>
+        </w:rPr>
+        <w:t xml:space="preserve"> #知識庫流程</w:t>
       </w:r>
     </w:p>
     <w:p>
@@ -1412,6 +1534,23 @@
       <w:r>
         <w:rPr>
           <w:rFonts w:ascii="Microsoft JhengHei" w:hAnsi="Microsoft JhengHei" w:eastAsia="Microsoft JhengHei"/>
+          <w:b/>
+          <w:sz w:val="21"/>
+        </w:rPr>
+        <w:t>標籤：</w:t>
+      </w:r>
+      <w:r>
+        <w:rPr>
+          <w:rFonts w:ascii="Microsoft JhengHei" w:hAnsi="Microsoft JhengHei" w:eastAsia="Microsoft JhengHei"/>
+          <w:sz w:val="21"/>
+        </w:rPr>
+        <w:t xml:space="preserve"> #精選案例 #案例萃取 #溯源連結</w:t>
+      </w:r>
+    </w:p>
+    <w:p>
+      <w:r>
+        <w:rPr>
+          <w:rFonts w:ascii="Microsoft JhengHei" w:hAnsi="Microsoft JhengHei" w:eastAsia="Microsoft JhengHei"/>
           <w:sz w:val="21"/>
         </w:rPr>
         <w:t>先讓AI看得懂我給他的東西，翻譯成Markdown檔，然後我要建立個別的知識庫，然後每個知識庫，還會再做一層案例的萃取，比如說把剛剛的那個，投資金域這本書，來做成一個投資金域的案例，精選案例另外一個知識庫，然後我再做任何搜尋，都會先看那個精選案例，再回去看原文，然後我會做這兩個的溯源連結，所以我在精選案例裡面的任何內容，都可以隨時找到，那個原文裡面在哪一個章節，然後再透過兩個層次的搜尋。</w:t>
@@ -1468,6 +1607,23 @@
       <w:r>
         <w:rPr>
           <w:rFonts w:ascii="Microsoft JhengHei" w:hAnsi="Microsoft JhengHei" w:eastAsia="Microsoft JhengHei"/>
+          <w:b/>
+          <w:sz w:val="21"/>
+        </w:rPr>
+        <w:t>標籤：</w:t>
+      </w:r>
+      <w:r>
+        <w:rPr>
+          <w:rFonts w:ascii="Microsoft JhengHei" w:hAnsi="Microsoft JhengHei" w:eastAsia="Microsoft JhengHei"/>
+          <w:sz w:val="21"/>
+        </w:rPr>
+        <w:t xml:space="preserve"> #關鍵字搜尋 #語意搜尋</w:t>
+      </w:r>
+    </w:p>
+    <w:p>
+      <w:r>
+        <w:rPr>
+          <w:rFonts w:ascii="Microsoft JhengHei" w:hAnsi="Microsoft JhengHei" w:eastAsia="Microsoft JhengHei"/>
           <w:sz w:val="21"/>
         </w:rPr>
         <w:t>透過關鍵字跟透過寓意搜尋，去得到我想要的東西，我知道那個大部分的新手。</w:t>
@@ -1518,6 +1674,23 @@
             </a:graphic>
           </wp:inline>
         </w:drawing>
+      </w:r>
+    </w:p>
+    <w:p>
+      <w:r>
+        <w:rPr>
+          <w:rFonts w:ascii="Microsoft JhengHei" w:hAnsi="Microsoft JhengHei" w:eastAsia="Microsoft JhengHei"/>
+          <w:b/>
+          <w:sz w:val="21"/>
+        </w:rPr>
+        <w:t>標籤：</w:t>
+      </w:r>
+      <w:r>
+        <w:rPr>
+          <w:rFonts w:ascii="Microsoft JhengHei" w:hAnsi="Microsoft JhengHei" w:eastAsia="Microsoft JhengHei"/>
+          <w:sz w:val="21"/>
+        </w:rPr>
+        <w:t xml:space="preserve"> #進階課程</w:t>
       </w:r>
     </w:p>
     <w:p>

</xml_diff>